<commit_message>
Refine diploma introduction structure
Co-authored-by: Dmitry <Enotfttp@users.noreply.github.com>
</commit_message>
<xml_diff>
--- a/src/diplom_gpt.docx
+++ b/src/diplom_gpt.docx
@@ -1492,7 +1492,7 @@
           <w:b w:val="0"/>
           <w:sz w:val="28"/>
         </w:rPr>
-        <w:t>В современных условиях закупочная деятельность занимает важное место в развитии как государственных, так и коммерческих организаций. Для предприятий, участвующих в тендерах, закупочные процедуры являются не только способом заключения договоров, но и самостоятельным направлением конкурентной борьбы. Победа в закупке зависит от цены, качества предложения, своевременности подготовки документов, знания законодательства и умения работать с электронными торговыми площадками. Поэтому профессиональный уровень тендерных специалистов напрямую влияет на объем выручки, финансовый результат, деловую репутацию и устойчивость компании на рынке.</w:t>
+        <w:t>Актуальность темы выпускной квалификационной работы «Совершенствование системы обучения и развития тендерных специалистов» обусловлена возрастающей ролью закупочной деятельности в современной экономике. Для организаций, работающих с государственными и корпоративными заказчиками, участие в тендерах является не только способом получения контрактов, но и важным фактором конкурентоспособности. Результат закупочной процедуры зависит от качества анализа документации, правильности расчета цены, соблюдения требований 44-ФЗ и 223-ФЗ, умения работать с электронными торговыми площадками и своевременного оформления комплекта документов. Поэтому профессиональная подготовка тендерных специалистов непосредственно влияет на выручку, прибыль, деловую репутацию и устойчивость предприятия.</w:t>
       </w:r>
     </w:p>
     <w:p>
@@ -1506,7 +1506,7 @@
           <w:b w:val="0"/>
           <w:sz w:val="28"/>
         </w:rPr>
-        <w:t>Актуальность темы выпускной квалификационной работы обусловлена тем, что сфера закупок постоянно усложняется. Законодательство о контрактной системе и закупках отдельных видов юридических лиц регулярно изменяется, электронные площадки обновляют требования к подаче заявок, заказчики предъявляют более детальные условия к подтверждению опыта, квалификации, происхождения товаров и комплектности документов. В такой среде недостаточно один раз обучить сотрудника базовым правилам участия в торгах. Необходима системная, постоянно обновляемая модель обучения и развития, которая позволяет специалистам своевременно осваивать изменения, снижать количество ошибок и повышать результативность участия в закупочных процедурах.</w:t>
+        <w:t>Актуальность темы проявляется и в том, что сфера закупок постоянно изменяется. Законодательные требования обновляются, заказчики детализируют условия допуска, электронные площадки совершенствуют цифровые процедуры, а конкуренция за выгодные контракты усиливается. В таких условиях разовых обучающих мероприятий недостаточно. Организации необходима системная работа по развитию компетенций сотрудников: адаптация новых специалистов, регулярное обновление знаний, закрепление актуальных шаблонов, контроль качества заявок, разбор ошибок и оценка влияния обучения на результаты деятельности.</w:t>
       </w:r>
     </w:p>
     <w:p>
@@ -1520,7 +1520,7 @@
           <w:b w:val="0"/>
           <w:sz w:val="28"/>
         </w:rPr>
-        <w:t>Практическая актуальность темы особенно значима для организаций, в которых тендерная деятельность является одним из основных источников дохода. Ошибки тендерных специалистов имеют прямые экономические последствия: заявка может быть отклонена до стадии торгов, компания теряет возможность заключить контракт, рабочее время сотрудников расходуется без результата, а повторяющиеся нарушения снижают доверие к внутренним процессам. Если обучение персонала носит случайный характер, знания остаются у отдельных сотрудников и не превращаются в общий ресурс организации. В результате компания становится зависимой от личного опыта конкретных работников, что особенно рискованно при текучести кадров и удаленном формате работы.</w:t>
+        <w:t>Для ООО «Лайф Медиа» выбранная тема имеет прикладное значение. Компания специализируется на оптовых поставках техники и оборудования, работает на рынках B2B и B2G и активно участвует в государственных и корпоративных закупках. Тендерный отдел является одним из ключевых подразделений предприятия, так как именно он обеспечивает значительную часть выручки. При этом анализ деятельности компании показывает наличие проблем: часть заявок отклоняется на этапе допуска, сотрудники используют разрозненные материалы, обучение проводится эпизодически, а адаптация новых специалистов зависит преимущественно от устных пояснений руководителя и помощи коллег.</w:t>
       </w:r>
     </w:p>
     <w:p>
@@ -1534,7 +1534,7 @@
           <w:b w:val="0"/>
           <w:sz w:val="28"/>
         </w:rPr>
-        <w:t>Тема ВКР — «Совершенствование системы обучения и развития тендерных специалистов» — является актуальной и для исследуемого предприятия ООО «Лайф Медиа». Компания специализируется на оптовых поставках техники и оборудования, работает на рынках B2B и B2G и активно участвует в государственных и корпоративных закупках. Ключевым подразделением предприятия является тендерный отдел, который обеспечивает значительную долю выручки. При этом результаты анализа показали, что в компании сохраняются проблемы, связанные с высокой долей отклоненных заявок, недостаточной системностью адаптации новых сотрудников, отсутствием единой базы актуальных шаблонов, эпизодическим характером обучения и слабой связью обучения с мотивацией и оценкой результатов.</w:t>
+        <w:t>Краткая характеристика предприятия подтверждает необходимость исследования. ООО «Лайф Медиа» относится к малому бизнесу, имеет линейно-функциональную структуру управления и использует преимущественно удаленный формат работы. Такой формат позволяет привлекать специалистов из разных регионов, но одновременно требует высокой цифровой дисциплины, единых стандартов подготовки документов и доступной базы знаний. Основная цель развития компании связана с повышением результативности участия в закупках, увеличением доли выигранных тендеров и расширением географии поставок. Достижение этих целей невозможно без совершенствования системы обучения и развития тендерных специалистов.</w:t>
       </w:r>
     </w:p>
     <w:p>
@@ -1545,10 +1545,9 @@
       <w:r>
         <w:rPr>
           <w:rFonts w:ascii="Times New Roman" w:hAnsi="Times New Roman"/>
-          <w:b w:val="0"/>
-          <w:sz w:val="28"/>
-        </w:rPr>
-        <w:t>Краткая характеристика ООО «Лайф Медиа» подтверждает значимость выбранной темы. Предприятие относится к малому бизнесу, имеет линейно-функциональную структуру управления и использует преимущественно удаленный формат работы. Такой формат позволяет привлекать специалистов из разных регионов и снижать часть административных расходов, но одновременно повышает требования к цифровой дисциплине, регламентации процессов, доступности актуальных материалов и прозрачности контроля. Для тендерного отдела, работающего с ЕИС, ЭТП, электронными документами, расчетами НМЦК и требованиями 44-ФЗ и 223-ФЗ, отсутствие единой системы обучения создает риск повторения ошибок и потери контрактов.</w:t>
+          <w:sz w:val="28"/>
+        </w:rPr>
+        <w:t>Проблема совершенствования обучения тендерных специалистов имеет значение не только для кадровой службы, но и для всей системы управления предприятием. Если сотрудник недостаточно уверенно ориентируется в требованиях закупочной документации, использует устаревший шаблон или допускает техническую ошибку при загрузке файлов, компания теряет не учебный результат, а реальную коммерческую возможность. Поэтому развитие тендерных специалистов связано с управлением рисками, повышением качества внутренних процессов и укреплением конкурентных преимуществ организации.</w:t>
       </w:r>
     </w:p>
     <w:p>
@@ -1559,10 +1558,9 @@
       <w:r>
         <w:rPr>
           <w:rFonts w:ascii="Times New Roman" w:hAnsi="Times New Roman"/>
-          <w:b w:val="0"/>
-          <w:sz w:val="28"/>
-        </w:rPr>
-        <w:t>Новизна работы заключается в том, что обучение тендерных специалистов рассматривается не как отдельное образовательное мероприятие, а как управленческая система, связанная с результатами закупочной деятельности. В работе обосновывается необходимость перехода от разовых вебинаров и устных пояснений к внутренней модели развития, включающей базу знаний, адаптационный маршрут, наставничество, чек-листы подготовки заявок, реестр ошибок, внешнее повышение квалификации и оценку экономической эффективности. Такой подход позволяет соединить кадровые, организационные и финансовые аспекты проблемы.</w:t>
+          <w:sz w:val="28"/>
+        </w:rPr>
+        <w:t>Особенность выбранной темы состоит в том, что обучение в сфере закупок должно быть максимально приближено к практической деятельности. Для тендерного отдела недостаточно общих лекций по управлению персоналом или разовых вебинаров по изменениям законодательства. Необходима система, в которой знания регулярно обновляются, ошибки фиксируются и превращаются в учебные кейсы, новые сотрудники проходят понятный адаптационный маршрут, а результаты обучения оцениваются через конкретные показатели: долю допущенных заявок, количество выигранных контрактов, снижение повторяющихся ошибок и экономический эффект для предприятия.</w:t>
       </w:r>
     </w:p>
     <w:p>
@@ -1576,7 +1574,7 @@
           <w:b w:val="0"/>
           <w:sz w:val="28"/>
         </w:rPr>
-        <w:t>Объектом исследования является система управления персоналом ООО «Лайф Медиа». Предметом исследования выступает система обучения и развития тендерных специалистов ООО «Лайф Медиа», включая организацию адаптации, обновление профессиональных знаний, передачу опыта, контроль качества подготовки заявок и оценку эффективности обучения.</w:t>
+        <w:t>Новизна темы заключается в рассмотрении обучения тендерных специалистов не как отдельного кадрового мероприятия, а как управляемой системы, связанной с бизнес-показателями предприятия. В работе обучение рассматривается через взаимосвязь адаптации, базы знаний, наставничества, чек-листов, реестра ошибок, внешнего повышения квалификации, KPI и оценки экономической эффективности. Такой подход позволяет перейти от фрагментарного обучения к целостному механизму повышения качества тендерной деятельности.</w:t>
       </w:r>
     </w:p>
     <w:p>
@@ -1590,7 +1588,7 @@
           <w:b w:val="0"/>
           <w:sz w:val="28"/>
         </w:rPr>
-        <w:t>Цель выпускной квалификационной работы состоит в разработке и экономическом обосновании рекомендаций по совершенствованию системы обучения и развития тендерных специалистов ООО «Лайф Медиа», направленных на снижение количества формальных ошибок при подготовке заявок, повышение профессиональных компетенций сотрудников и рост эффективности участия предприятия в тендерных процедурах.</w:t>
+        <w:t>Объектом выпускной квалификационной работы является система управления персоналом ООО «Лайф Медиа». Предметом исследования является система обучения и развития тендерных специалистов ООО «Лайф Медиа», включающая адаптацию, обновление профессиональных знаний, передачу опыта, контроль качества подготовки заявок и оценку эффективности обучающих мероприятий.</w:t>
       </w:r>
     </w:p>
     <w:p>
@@ -1604,7 +1602,7 @@
           <w:b w:val="0"/>
           <w:sz w:val="28"/>
         </w:rPr>
-        <w:t>Для достижения поставленной цели необходимо решить следующие задачи:</w:t>
+        <w:t>Цель выпускной квалификационной работы состоит в выявлении проблем действующей системы обучения и развития тендерных специалистов ООО «Лайф Медиа», разработке и обосновании практических рекомендаций по ее совершенствованию, а также в оценке социально-экономической эффективности предлагаемых мероприятий.</w:t>
       </w:r>
     </w:p>
     <w:p>
@@ -1618,7 +1616,7 @@
           <w:b w:val="0"/>
           <w:sz w:val="28"/>
         </w:rPr>
-        <w:t>1. Рассмотреть теоретические основы обучения и развития персонала в системе управления организацией и определить специфику подготовки тендерных специалистов.</w:t>
+        <w:t>Для достижения поставленной цели необходимо решить следующие задачи:</w:t>
       </w:r>
     </w:p>
     <w:p>
@@ -1632,7 +1630,7 @@
           <w:b w:val="0"/>
           <w:sz w:val="28"/>
         </w:rPr>
-        <w:t>2. Изучить современные подходы к развитию профессиональных компетенций специалистов в сфере закупок, включая цифровые инструменты, практико-ориентированное обучение и методы оценки эффективности.</w:t>
+        <w:t>1. Рассмотреть теоретические основы обучения и развития персонала в системе управления организацией.</w:t>
       </w:r>
     </w:p>
     <w:p>
@@ -1646,7 +1644,7 @@
           <w:b w:val="0"/>
           <w:sz w:val="28"/>
         </w:rPr>
-        <w:t>3. Охарактеризовать ООО «Лайф Медиа», структуру его закупочной деятельности и роль тендерного отдела в финансовых результатах предприятия.</w:t>
+        <w:t>2. Изучить специфику профессиональных компетенций тендерных специалистов и современные подходы к их развитию.</w:t>
       </w:r>
     </w:p>
     <w:p>
@@ -1660,7 +1658,7 @@
           <w:b w:val="0"/>
           <w:sz w:val="28"/>
         </w:rPr>
-        <w:t>4. Проанализировать действующую систему управления персоналом и обучения тендерных специалистов, выявить ее сильные стороны, ограничения и ключевые проблемы.</w:t>
+        <w:t>3. Охарактеризовать ООО «Лайф Медиа», сферу его деятельности, структуру закупочной работы и роль тендерного отдела.</w:t>
       </w:r>
     </w:p>
     <w:p>
@@ -1674,7 +1672,7 @@
           <w:b w:val="0"/>
           <w:sz w:val="28"/>
         </w:rPr>
-        <w:t>5. Провести оценку эффективности текущей системы обучения на основе анализа тендерных показателей, внутренних данных и результатов анкетирования сотрудников.</w:t>
+        <w:t>4. Проанализировать действующую систему управления персоналом, обучения и развития тендерных специалистов на предприятии.</w:t>
       </w:r>
     </w:p>
     <w:p>
@@ -1688,7 +1686,7 @@
           <w:b w:val="0"/>
           <w:sz w:val="28"/>
         </w:rPr>
-        <w:t>6. Разработать комплекс мероприятий по совершенствованию системы обучения и развития тендерных специалистов с учетом выявленных проблем и особенностей предприятия.</w:t>
+        <w:t>5. Выявить основные проблемы текущей системы обучения на основе анализа документов, показателей тендерной деятельности и опроса сотрудников.</w:t>
       </w:r>
     </w:p>
     <w:p>
@@ -1702,7 +1700,7 @@
           <w:b w:val="0"/>
           <w:sz w:val="28"/>
         </w:rPr>
-        <w:t>7. Рассчитать затраты на внедрение предложенных мероприятий и оценить их социально-экономическую эффективность.</w:t>
+        <w:t>6. Разработать комплекс рекомендаций по совершенствованию системы обучения и развития тендерных специалистов ООО «Лайф Медиа».</w:t>
       </w:r>
     </w:p>
     <w:p>
@@ -1716,7 +1714,7 @@
           <w:b w:val="0"/>
           <w:sz w:val="28"/>
         </w:rPr>
-        <w:t>В работе использованы следующие методы исследования: описательный метод, анализ научной и учебной литературы, анализ нормативно-правовых документов, анализ внутренней документации предприятия, экономический анализ, сравнительный анализ, структурно-логический анализ, анкетирование сотрудников, экспертно-анкетная оценка, шкалирование по Лайкерту, анализ разрывов, табличный метод, расчет показателей экономической эффективности, расчет ROI и дисконтированного дохода.</w:t>
+        <w:t>7. Рассчитать затраты на внедрение предложенных мероприятий и оценить их экономическую эффективность.</w:t>
       </w:r>
     </w:p>
     <w:p>
@@ -1730,7 +1728,21 @@
           <w:b w:val="0"/>
           <w:sz w:val="28"/>
         </w:rPr>
-        <w:t>Структура выпускной квалификационной работы соответствует цели и задачам исследования. Работа состоит из введения, трех глав, заключения, списка использованных источников и приложений. В первой главе раскрываются теоретические основы обучения и развития персонала, специфика компетенций тендерных специалистов и подходы к оценке эффективности обучения. Во второй главе проводится анализ ООО «Лайф Медиа», системы управления персоналом, текущего состояния обучения тендерных специалистов и проблем, влияющих на качество подготовки заявок. В третьей главе разрабатываются рекомендации по совершенствованию системы обучения, обосновывается технология их внедрения и рассчитывается экономическая эффективность предложенных мероприятий.</w:t>
+        <w:t>В работе использованы следующие методы исследования: описательный метод, анализ научной и учебной литературы, анализ нормативно-правовых документов, анализ внутренней документации предприятия, сравнительный анализ, экономический анализ, анкетирование, экспертно-анкетная оценка, шкалирование по Лайкерту, анализ разрывов, табличный метод, расчет ROI, срока окупаемости и дисконтированного дохода.</w:t>
+      </w:r>
+    </w:p>
+    <w:p>
+      <w:pPr>
+        <w:spacing w:line="360" w:lineRule="auto" w:after="120"/>
+        <w:ind w:firstLine="700"/>
+      </w:pPr>
+      <w:r>
+        <w:rPr>
+          <w:rFonts w:ascii="Times New Roman" w:hAnsi="Times New Roman"/>
+          <w:b w:val="0"/>
+          <w:sz w:val="28"/>
+        </w:rPr>
+        <w:t>Структура выпускной квалификационной работы соответствует цели и задачам исследования. Работа состоит из введения, трех глав, заключения, списка использованных источников и приложений. В первой главе рассматриваются теоретические основы обучения и развития персонала, особенности компетенций тендерных специалистов и подходы к оценке эффективности обучения. Во второй главе анализируется деятельность ООО «Лайф Медиа», система управления персоналом и текущее состояние обучения тендерного отдела. В третьей главе разрабатываются рекомендации по совершенствованию системы обучения и развития тендерных специалистов, приводится технико-экономическое обоснование мероприятий и расчет их эффективности.</w:t>
       </w:r>
     </w:p>
     <w:p>

</xml_diff>

<commit_message>
Restore full diploma source list
Co-authored-by: Dmitry <Enotfttp@users.noreply.github.com>
</commit_message>
<xml_diff>
--- a/src/diplom_gpt.docx
+++ b/src/diplom_gpt.docx
@@ -39145,10 +39145,10 @@
       <w:r>
         <w:rPr>
           <w:rFonts w:ascii="Times New Roman" w:hAnsi="Times New Roman"/>
-          <w:b/>
-          <w:sz w:val="28"/>
-        </w:rPr>
-        <w:t>I. Нормативные правовые документы</w:t>
+          <w:b w:val="0"/>
+          <w:sz w:val="28"/>
+        </w:rPr>
+        <w:t>1. Пугачев, В. П. Управление персоналом организации : практикум : учебник для вузов / В. П. Пугачев. — 2-е изд., испр. и доп. — Москва : Юрайт, 2026. — 280 с. — ISBN 978-5-534-08906-6.</w:t>
       </w:r>
     </w:p>
     <w:p>
@@ -39161,7 +39161,7 @@
           <w:b w:val="0"/>
           <w:sz w:val="28"/>
         </w:rPr>
-        <w:t>1. О закупках товаров, работ, услуг отдельными видами юридических лиц : Федеральный закон от 18 июля 2011 г. № 223-ФЗ : ред. от 26 дек. 2024 г. // Собрание законодательства Российской Федерации. — 2011. — № 30, ч. 1. — Ст. 4571.</w:t>
+        <w:t>2. Управление персоналом : учебник и практикум для среднего профессионального образования / под общ. ред. О. А. Лапшовой. — Москва : Юрайт, 2026. — 406 с. — ISBN 978-5-534-01928-5. — Текст : электронный // Образовательная платформа Юрайт. — URL: https://urait.ru/bcode/584739 (дата обращения: 18.02.2026).</w:t>
       </w:r>
     </w:p>
     <w:p>
@@ -39174,7 +39174,7 @@
           <w:b w:val="0"/>
           <w:sz w:val="28"/>
         </w:rPr>
-        <w:t>2. О контрактной системе в сфере закупок товаров, работ, услуг для обеспечения государственных и муниципальных нужд : Федеральный закон от 5 апр. 2013 г. № 44-ФЗ : ред. от 26 дек. 2024 г. // Собрание законодательства Российской Федерации. — 2013. — № 14. — Ст. 1652.</w:t>
+        <w:t>3. Тонких, Н. В. Пандемия как драйвер цифровых форматов обучения и развития персонала: кейс крупной российской IT-компании / Н. В. Тонких, Д. А. Бахур // Вестник Омского университета. Серия: Экономика. — 2022. — Т. 20, № 2. — С. 84–94.</w:t>
       </w:r>
     </w:p>
     <w:p>
@@ -39187,7 +39187,7 @@
           <w:b w:val="0"/>
           <w:sz w:val="28"/>
         </w:rPr>
-        <w:t>3. Трудовой кодекс Российской Федерации : Федеральный закон от 30 дек. 2001 г. № 197-ФЗ : ред. от 14 февр. 2024 г. // Собрание законодательства Российской Федерации. — 2002. — № 1, ч. 1. — Ст. 3.</w:t>
+        <w:t>4. Гайфуллина, М. М. Формирование стратегии эффективного управления человеческими ресурсами нефтяной компании / М. М. Гайфуллина, Г. З. Низамова, В. М. Маков // Нефтяное хозяйство. — 2019. — № 4. — С. 8–11.</w:t>
       </w:r>
     </w:p>
     <w:p>
@@ -39197,10 +39197,10 @@
       <w:r>
         <w:rPr>
           <w:rFonts w:ascii="Times New Roman" w:hAnsi="Times New Roman"/>
-          <w:b/>
-          <w:sz w:val="28"/>
-        </w:rPr>
-        <w:t>II. Научная и учебная литература</w:t>
+          <w:b w:val="0"/>
+          <w:sz w:val="28"/>
+        </w:rPr>
+        <w:t>5. Галимзянов, И. В. Наставничество как метод обучения и развития персонала / И. В. Галимзянов, Л. А. Гилимханова // Актуальные вопросы современной науки и образования : сб. ст. VII Междунар. науч.-практ. конф. — Пенза : Наука и Просвещение, 2021. — С. 39–41.</w:t>
       </w:r>
     </w:p>
     <w:p>
@@ -39213,7 +39213,7 @@
           <w:b w:val="0"/>
           <w:sz w:val="28"/>
         </w:rPr>
-        <w:t>4. Ансофф, И. Стратегический менеджмент : классическое издание / И. Ансофф ; пер. с англ. О. Литун. — Москва : Питер, 2009. — 342 с. — ISBN 978-5-388-00077-4.</w:t>
+        <w:t>6. Попов, А. А. Сравнительная характеристика моделей оценки эффективности в обучении персонала организации / А. А. Попов, С. М. Мальцева // Вестник Международного института рынка. — 2022. — № 2. — С. 44–47.</w:t>
       </w:r>
     </w:p>
     <w:p>
@@ -39226,7 +39226,7 @@
           <w:b w:val="0"/>
           <w:sz w:val="28"/>
         </w:rPr>
-        <w:t>5. Армстронг, М. Практика управления человеческими ресурсами / М. Армстронг ; пер. с англ. под ред. С. К. Мордовина. — Санкт-Петербург : Питер, 2019. — 831 с.</w:t>
+        <w:t>7. Армстронг, М. Практика управления человеческими ресурсами / М. Армстронг ; пер. с англ. под ред. С. К. Мордовина. — Санкт-Петербург : Питер, 2019. — 831 с.</w:t>
       </w:r>
     </w:p>
     <w:p>
@@ -39239,7 +39239,7 @@
           <w:b w:val="0"/>
           <w:sz w:val="28"/>
         </w:rPr>
-        <w:t>6. Егоршин, А. П. Управление персоналом : учебник / А. П. Егоршин. — 14-е изд., перераб. и доп. — Нижний Новгород : НИМБ, 2022. — 640 с.</w:t>
+        <w:t>8. Кирищиева, И. Р. Современная система профессионального развития персонала в таможенных органах / И. Р. Кирищиева, Д. А. Молокотина // Молодой ученый. — 2020. — № 15 (305). — С. 319–321.</w:t>
       </w:r>
     </w:p>
     <w:p>
@@ -39252,7 +39252,7 @@
           <w:b w:val="0"/>
           <w:sz w:val="28"/>
         </w:rPr>
-        <w:t>7. Захаров, Д. К. Организация обучения и повышения квалификации персонала : учебное пособие / Д. К. Захаров. — Москва : Дашков и К°, 2020. — 304 с.</w:t>
+        <w:t>9. Егоршин, А. П. Управление персоналом : учебник / А. П. Егоршин. — 14-е изд., перераб. и доп. — Нижний Новгород : НИМБ, 2022. — 640 с.</w:t>
       </w:r>
     </w:p>
     <w:p>
@@ -39265,7 +39265,7 @@
           <w:b w:val="0"/>
           <w:sz w:val="28"/>
         </w:rPr>
-        <w:t>8. Магура, М. И. Обучение персонала как конкурентное преимущество / М. И. Магура, М. Б. Курбатова. — Москва : Управление персоналом, 2004. — 216 с. — ISBN 5-95630-022-1.</w:t>
+        <w:t>10. Захаров, Д. К. Организация обучения и повышения квалификации персонала : учебное пособие / Д. К. Захаров. — Москва : Дашков и К°, 2020. — 304 с.</w:t>
       </w:r>
     </w:p>
     <w:p>
@@ -39278,7 +39278,7 @@
           <w:b w:val="0"/>
           <w:sz w:val="28"/>
         </w:rPr>
-        <w:t>9. Маслов, Е. В. Управление персоналом : учебник и практикум / Е. В. Маслов. — 3-е изд., перераб. и доп. — Москва : Юрайт, 2022. — 456 с.</w:t>
+        <w:t>11. Маслов, Е. В. Управление персоналом : учебник и практикум / Е. В. Маслов. — 3-е изд., перераб. и доп. — Москва : Юрайт, 2022. — 456 с.</w:t>
       </w:r>
     </w:p>
     <w:p>
@@ -39291,7 +39291,7 @@
           <w:b w:val="0"/>
           <w:sz w:val="28"/>
         </w:rPr>
-        <w:t>10. Пугачев, В. П. Управление персоналом организации : практикум : учебник для вузов / В. П. Пугачев. — 2-е изд., испр. и доп. — Москва : Юрайт, 2026. — 280 с. — ISBN 978-5-534-08906-6.</w:t>
+        <w:t>12. Ансофф, И. Стратегический менеджмент : классическое издание / И. Ансофф ; пер. с англ. О. Литун. — Москва : Питер, 2009. — 342 с. — ISBN 978-5-388-00077-4.</w:t>
       </w:r>
     </w:p>
     <w:p>
@@ -39304,7 +39304,7 @@
           <w:b w:val="0"/>
           <w:sz w:val="28"/>
         </w:rPr>
-        <w:t>11. Развитие персонала : учебное пособие / под ред. И. В. Ивановой. — Москва : Кнорус, 2023. — 256 с.</w:t>
+        <w:t>13. Магура, М. И. Обучение персонала как конкурентное преимущество / М. И. Магура, М. Б. Курбатова. — Москва : Управление персоналом, 2004. — 216 с. — ISBN 5-95630-022-1.</w:t>
       </w:r>
     </w:p>
     <w:p>
@@ -39317,7 +39317,7 @@
           <w:b w:val="0"/>
           <w:sz w:val="28"/>
         </w:rPr>
-        <w:t>12. Управление персоналом : учебник и практикум для среднего профессионального образования / под общ. ред. О. А. Лапшовой. — Москва : Юрайт, 2026. — 406 с. — ISBN 978-5-534-01928-5.</w:t>
+        <w:t>14. Левин, К. Разрешение социальных конфликтов / К. Левин ; пер. с англ. И. Ю. Авидон. — Санкт-Петербург : Речь, 2000. — 407 с. — ISBN 5-9268-0008-0.</w:t>
       </w:r>
     </w:p>
     <w:p>
@@ -39327,10 +39327,10 @@
       <w:r>
         <w:rPr>
           <w:rFonts w:ascii="Times New Roman" w:hAnsi="Times New Roman"/>
-          <w:b/>
-          <w:sz w:val="28"/>
-        </w:rPr>
-        <w:t>III. Периодические издания</w:t>
+          <w:b w:val="0"/>
+          <w:sz w:val="28"/>
+        </w:rPr>
+        <w:t>15. Ульрих, Д. HR в борьбе за конкурентное преимущество / Д. Ульрих, У. Брокбэнк ; пер. с англ. И. Новаш, М. Богомолова. — 2-е изд., доп. — Москва : Претекст, 2010. — 361 с. — ISBN 978-5-98995-059-1.</w:t>
       </w:r>
     </w:p>
     <w:p>
@@ -39343,7 +39343,7 @@
           <w:b w:val="0"/>
           <w:sz w:val="28"/>
         </w:rPr>
-        <w:t>13. Борзенкова, О. О. Систематизация подходов к повышению эффективности цифровых технологий в корпоративном обучении относительно поколений персонала / О. О. Борзенкова // Инновации. Наука. Образование. — 2022. — № 53. — С. 1409–1413.</w:t>
+        <w:t>16. Верна, В. В. Развитие цифровых технологий в корпоративном обучении персонала: перспективы использования образовательных экосистем / В. В. Верна, А. В. Сорока // Век качества. — 2022. — № 1. — С. 238–252.</w:t>
       </w:r>
     </w:p>
     <w:p>
@@ -39356,7 +39356,7 @@
           <w:b w:val="0"/>
           <w:sz w:val="28"/>
         </w:rPr>
-        <w:t>14. Верна, В. В. Развитие цифровых технологий в корпоративном обучении персонала: перспективы использования образовательных экосистем / В. В. Верна, А. В. Сорока // Век качества. — 2022. — № 1. — С. 238–252.</w:t>
+        <w:t>17. Петров, И. А. Цифровые технологии в управлении развитием персонала / И. А. Петров // Homo instagramus: человек в цифровом обществе. — Москва : МПГУ, 2018. — С. 231–235.</w:t>
       </w:r>
     </w:p>
     <w:p>
@@ -39369,7 +39369,7 @@
           <w:b w:val="0"/>
           <w:sz w:val="28"/>
         </w:rPr>
-        <w:t>15. Гайфуллина, М. М. Формирование стратегии эффективного управления человеческими ресурсами нефтяной компании / М. М. Гайфуллина, Г. З. Низамова, В. М. Маков // Нефтяное хозяйство. — 2019. — № 4. — С. 8–11.</w:t>
+        <w:t>18. Шарипова, Э. Х. Цифровые технологии в обучении персонала / Э. Х. Шарипова, А. Р. Кудлаева // Управление экономикой, системами, процессами : сб. ст. IV Междунар. науч.-практ. конф. — Пенза : Пензенский государственный аграрный университет, 2020. — С. 213–215.</w:t>
       </w:r>
     </w:p>
     <w:p>
@@ -39382,7 +39382,7 @@
           <w:b w:val="0"/>
           <w:sz w:val="28"/>
         </w:rPr>
-        <w:t>16. Галимзянов, И. В. Наставничество как метод обучения и развития персонала / И. В. Галимзянов, Л. А. Гилимханова // Актуальные вопросы современной науки и образования : сб. ст. VII Междунар. науч.-практ. конф. — Пенза : Наука и Просвещение, 2021. — С. 39–41.</w:t>
+        <w:t>19. Кауфман, Н. Ю. Взаимодействие HR Tech и обучения персонала / Н. Ю. Кауфман, С. Ю. Зеленцова // Вестник университета. — 2022. — № 6. — С. 23–30. — DOI 10.26425/1816-4277-2022-6-23-30.</w:t>
       </w:r>
     </w:p>
     <w:p>
@@ -39395,7 +39395,7 @@
           <w:b w:val="0"/>
           <w:sz w:val="28"/>
         </w:rPr>
-        <w:t>17. Гладилина, И. П. Повышение квалификации специалистов в сфере закупок на основе геймификации / И. П. Гладилина, Ю. А. Молоканова // Профессиональное образование в современном мире. — 2024. — Т. 14, № 3. — С. 112–119.</w:t>
+        <w:t>20. Егоров, С. В. Технологии повышения качества обучения персонала в условиях цифровой экономики / С. В. Егоров, А. С. Душейко, А. В. Рудницкая, Д. С. Арутюнов // Транспортное дело России. — 2021. — № 2. — С. 116–117. — DOI 10.52375/20728689_2021_2_116.</w:t>
       </w:r>
     </w:p>
     <w:p>
@@ -39408,7 +39408,7 @@
           <w:b w:val="0"/>
           <w:sz w:val="28"/>
         </w:rPr>
-        <w:t>18. Кауфман, Н. Ю. Взаимодействие HR Tech и обучения персонала / Н. Ю. Кауфман, С. Ю. Зеленцова // Вестник университета. — 2022. — № 6. — С. 23–30.</w:t>
+        <w:t>21. Чуланова, О. Л. Интеграция программного продукта game&amp;training как технологического тренда в обучение персонала организации в условиях цифровой трансформации / О. Л. Чуланова, М. Е. Данькина // Вестник Сургутского государственного университета. — 2024. — № 2 (32). — С. 79–90.</w:t>
       </w:r>
     </w:p>
     <w:p>
@@ -39421,7 +39421,7 @@
           <w:b w:val="0"/>
           <w:sz w:val="28"/>
         </w:rPr>
-        <w:t>19. Кирищиева, И. Р. Современная система профессионального развития персонала в таможенных органах / И. Р. Кирищиева, Д. А. Молокотина // Молодой ученый. — 2020. — № 15 (305). — С. 319–321.</w:t>
+        <w:t>22. Куликова, А. А. Особенности внутрифирменного обучения персонала в условиях цифровой экономики / А. А. Куликова // Юность науки : сб. студ. науч. ст. — Москва : РГГУ, 2021. — С. 100–107.</w:t>
       </w:r>
     </w:p>
     <w:p>
@@ -39434,7 +39434,7 @@
           <w:b w:val="0"/>
           <w:sz w:val="28"/>
         </w:rPr>
-        <w:t>20. Куликова, А. А. Особенности внутрифирменного обучения персонала в условиях цифровой экономики / А. А. Куликова // Юность науки : сб. студ. науч. ст. — Москва : РГГУ, 2021. — С. 100–107.</w:t>
+        <w:t>23. Борзенкова, О. О. Систематизация подходов к повышению эффективности цифровых технологий в корпоративном обучении относительно поколений персонала / О. О. Борзенкова // Инновации. Наука. Образование. — 2022. — № 53. — С. 1409–1413.</w:t>
       </w:r>
     </w:p>
     <w:p>
@@ -39447,7 +39447,7 @@
           <w:b w:val="0"/>
           <w:sz w:val="28"/>
         </w:rPr>
-        <w:t>21. Ладыкова, О. В. Концептуальные подходы к развитию профессиональной компетентности у сотрудников организации с использованием инновационных форм обучения / О. В. Ладыкова, Е. В. Сидорина, М. А. Сарычева // Проблемы современного педагогического образования. — 2018. — № 61-1. — С. 372–376.</w:t>
+        <w:t>24. Ладыкова, О. В. Концептуальные подходы к развитию профессиональной компетентности у сотрудников организации с использованием инновационных форм обучения / О. В. Ладыкова, Е. В. Сидорина, М. А. Сарычева // Проблемы современного педагогического образования. — 2018. — № 61-1. — С. 372–376.</w:t>
       </w:r>
     </w:p>
     <w:p>
@@ -39460,7 +39460,7 @@
           <w:b w:val="0"/>
           <w:sz w:val="28"/>
         </w:rPr>
-        <w:t>22. Николаева, А. Г. Development of Procurement Performance Indicators for Industrial Enterprises of the Russian Federation / А. Г. Николаева // Вестник Магнитогорского государственного технического университета им. Г. И. Носова. — 2019. — № 4. — С. 106–112.</w:t>
+        <w:t>25. Лисина, Е. С. Разработка тренинга развития профессиональных компетенций специалистов в сфере закупок : выпускная квалификационная работа [Электронный ресурс] / Е. С. Лисина. — Москва : НИУ ВШЭ, 2025. — URL: https://www.hse.ru/edu/vkr/1048201963 (дата обращения: 07.03.2026).</w:t>
       </w:r>
     </w:p>
     <w:p>
@@ -39473,7 +39473,7 @@
           <w:b w:val="0"/>
           <w:sz w:val="28"/>
         </w:rPr>
-        <w:t>23. Попов, А. А. Сравнительная характеристика моделей оценки эффективности в обучении персонала организации / А. А. Попов, С. М. Мальцева // Вестник Международного института рынка. — 2022. — № 2. — С. 44–47.</w:t>
+        <w:t>26. BiCoTender. Что должен знать специалист по закупкам? [Электронный ресурс]. — URL: https://www.bicotender.ru/faq/chto-dolzhen-znat-specialist-po-zakupkam.html (дата обращения: 07.03.2026).</w:t>
       </w:r>
     </w:p>
     <w:p>
@@ -39486,7 +39486,7 @@
           <w:b w:val="0"/>
           <w:sz w:val="28"/>
         </w:rPr>
-        <w:t>24. Тонких, Н. В. Пандемия как драйвер цифровых форматов обучения и развития персонала: кейс крупной российской IT-компании / Н. В. Тонких, Д. А. Бахур // Вестник Омского университета. Серия: Экономика. — 2022. — Т. 20, № 2. — С. 84–94.</w:t>
+        <w:t>27. Добротина, О. Функционал тендерного специалиста для победы и прибыли компании [Электронный ресурс] / О. Добротина // РБК Компании. — URL: https://companies.rbc.ru/news/c4poJFCEYm/funktsional-tendernogo-spetsialista-dlya-pobedyi-i-pribyili-kompanii/ (дата обращения: 07.03.2026).</w:t>
       </w:r>
     </w:p>
     <w:p>
@@ -39496,10 +39496,10 @@
       <w:r>
         <w:rPr>
           <w:rFonts w:ascii="Times New Roman" w:hAnsi="Times New Roman"/>
-          <w:b/>
-          <w:sz w:val="28"/>
-        </w:rPr>
-        <w:t>IV. Иностранные издания</w:t>
+          <w:b w:val="0"/>
+          <w:sz w:val="28"/>
+        </w:rPr>
+        <w:t>28. Сибирский федеральный университет. Программа профессиональной переподготовки «Управление государственными, муниципальными и корпоративными закупками» [Электронный ресурс]. — URL: https://www.sfu-kras.ru (дата обращения: 10.03.2026).</w:t>
       </w:r>
     </w:p>
     <w:p>
@@ -39512,7 +39512,7 @@
           <w:b w:val="0"/>
           <w:sz w:val="28"/>
         </w:rPr>
-        <w:t>25. Gertler, P. J. Impact Evaluation in Practice / P. J. Gertler, S. Martinez, P. Premand, L. B. Rawlings, C. M. J. Vermeersch. — 3rd ed. — Washington : World Bank ; Inter-American Development Bank, 2024. — 398 p.</w:t>
+        <w:t>29. Национальный исследовательский университет «Высшая школа экономики» (Пермь). Программа повышения квалификации «Управление закупками: эффективные стратегии и практики» [Электронный ресурс]. — URL: https://perm.hse.ru (дата обращения: 10.03.2026).</w:t>
       </w:r>
     </w:p>
     <w:p>
@@ -39525,7 +39525,7 @@
           <w:b w:val="0"/>
           <w:sz w:val="28"/>
         </w:rPr>
-        <w:t>26. Kelman, S. Procurement and Public Management: The Fear of Discretion and the Quality of Government Performance / S. Kelman. — 2nd ed. — Washington : AEI Press, 2022. — 240 p.</w:t>
+        <w:t>30. ЭТП Аудиториум. Проект «Закупочные решения: игровые методы обучения» [Электронный ресурс]. — URL: https://etpgpb.ru (дата обращения: 11.03.2026).</w:t>
       </w:r>
     </w:p>
     <w:p>
@@ -39538,7 +39538,7 @@
           <w:b w:val="0"/>
           <w:sz w:val="28"/>
         </w:rPr>
-        <w:t>27. Lewin, K. Resolving Social Conflicts / K. Lewin. — New York : Harper &amp; Row, 1948. — 230 p.</w:t>
+        <w:t>31. Гладилина, И. П. Повышение квалификации специалистов в сфере закупок на основе геймификации / И. П. Гладилина, Ю. А. Молоканова // Профессиональное образование в современном мире. — 2024. — Т. 14, № 3. — С. 112–119.</w:t>
       </w:r>
     </w:p>
     <w:p>
@@ -39551,7 +39551,7 @@
           <w:b w:val="0"/>
           <w:sz w:val="28"/>
         </w:rPr>
-        <w:t>28. Ulrich, D. HR Competencies: Mastery at the Intersection of People and Business / D. Ulrich, W. Brockbank. — Alexandria : Society for Human Resource Management, 2008. — 272 p.</w:t>
+        <w:t>32. Госкомитет Республики Татарстан по закупкам. Проект «Закупщик. Новое поколение» [Электронный ресурс]. — URL: https://zakupki.tatarstan.ru (дата обращения: 11.03.2026).</w:t>
       </w:r>
     </w:p>
     <w:p>
@@ -39561,10 +39561,10 @@
       <w:r>
         <w:rPr>
           <w:rFonts w:ascii="Times New Roman" w:hAnsi="Times New Roman"/>
-          <w:b/>
-          <w:sz w:val="28"/>
-        </w:rPr>
-        <w:t>V. Ресурсы сети Интернет</w:t>
+          <w:b w:val="0"/>
+          <w:sz w:val="28"/>
+        </w:rPr>
+        <w:t>33. ЭТП РЕГИОН. Проект «Школа профессионалов» [Электронный ресурс]. — URL: https://www.region-ast.ru (дата обращения: 12.03.2026).</w:t>
       </w:r>
     </w:p>
     <w:p>
@@ -39577,7 +39577,7 @@
           <w:b w:val="0"/>
           <w:sz w:val="28"/>
         </w:rPr>
-        <w:t>29. Банк России. Ключевая ставка Банка России [Электронный ресурс]. — URL: https://cbr.ru/hd_base/keyrate/ (дата обращения: 28.04.2026).</w:t>
+        <w:t>34. Сакып, Т. Р. Практикум по дисциплине «Экспертиза в закупочной деятельности» [Электронный ресурс] / Т. Р. Сакып, М. А. Лихачев // Сибирский федеральный университет. — URL: https://research.sfu-kras.ru/publications/publication/85990838 (дата обращения: 10.03.2026).</w:t>
       </w:r>
     </w:p>
     <w:p>
@@ -39590,7 +39590,7 @@
           <w:b w:val="0"/>
           <w:sz w:val="28"/>
         </w:rPr>
-        <w:t>30. Битрикс24. Тарифы и цены [Электронный ресурс]. — URL: https://www.bitrix24.ru/prices/ (дата обращения: 28.04.2026).</w:t>
+        <w:t>35. Добротина, О. Как выстроить систему корпоративного обучения для тендерного отдела [Электронный ресурс] / О. Добротина // РБК Компании. — URL: https://companies.rbc.ru (дата обращения: 10.03.2026).</w:t>
       </w:r>
     </w:p>
     <w:p>
@@ -39603,7 +39603,7 @@
           <w:b w:val="0"/>
           <w:sz w:val="28"/>
         </w:rPr>
-        <w:t>31. Добротина, О. Функционал тендерного специалиста для победы и прибыли компании [Электронный ресурс] / О. Добротина // РБК Компании. — URL: https://companies.rbc.ru/news/c4poJFCEYm/funktsional-tendernogo-spetsialista-dlya-pobedyi-i-pribyili-kompanii/ (дата обращения: 07.03.2026).</w:t>
+        <w:t>36. Развитие персонала : учебное пособие / под ред. И. В. Ивановой. — Москва : Кнорус, 2023. — 256 с.</w:t>
       </w:r>
     </w:p>
     <w:p>
@@ -39616,7 +39616,7 @@
           <w:b w:val="0"/>
           <w:sz w:val="28"/>
         </w:rPr>
-        <w:t>32. iSpring Learn. LMS Pricing [Электронный ресурс]. — URL: https://ispringsolutions.com/ispring-learn/pricing (дата обращения: 28.04.2026).</w:t>
+        <w:t>37. Измерение отдачи инвестиций в программе развития персонала [Электронный ресурс]. — URL: https://studfile.net/preview/10744172/page:9/ (дата обращения: 13.03.2026).</w:t>
       </w:r>
     </w:p>
     <w:p>
@@ -39629,7 +39629,7 @@
           <w:b w:val="0"/>
           <w:sz w:val="28"/>
         </w:rPr>
-        <w:t>33. BiCoTender. Что должен знать специалист по закупкам? [Электронный ресурс]. — URL: https://www.bicotender.ru/faq/chto-dolzhen-znat-specialist-po-zakupkam.html (дата обращения: 07.03.2026).</w:t>
+        <w:t>38. Черников, А. Ю. Методика оценки окупаемости инвестиций в образовательные программы для персонала [Электронный ресурс] / А. Ю. Черников. — URL: https://cyberleninka.ru/article/n/metodika-otsenki-okupaemosti-investitsiy-v-obrazovatelnye-programmy-personala (дата обращения: 11.03.2026).</w:t>
       </w:r>
     </w:p>
     <w:p>
@@ -39642,7 +39642,7 @@
           <w:b w:val="0"/>
           <w:sz w:val="28"/>
         </w:rPr>
-        <w:t>34. Контур.Школа. Курсы повышения квалификации по 44-ФЗ и 223-ФЗ [Электронный ресурс]. — URL: https://school.kontur-f.ru/ (дата обращения: 28.04.2026).</w:t>
+        <w:t>39. Процент программ, оцениваемых по различным уровням модели Киркпатрика/Филлипса [Электронный ресурс]. — URL: https://www.kpilib.ru/indicator.php?indicator_id=3322 (дата обращения: 11.03.2026).</w:t>
       </w:r>
     </w:p>
     <w:p>
@@ -39655,7 +39655,7 @@
           <w:b w:val="0"/>
           <w:sz w:val="28"/>
         </w:rPr>
-        <w:t>35. КриптоПро. Прайс-лист на лицензии КриптоПро CSP [Электронный ресурс]. — URL: https://cryptopro.ru/buy/price (дата обращения: 28.04.2026).</w:t>
+        <w:t>40. Николаева, А. Г. Development of Procurement Performance Indicators for Industrial Enterprises of the Russian Federation / А. Г. Николаева // Вестник Магнитогорского государственного технического университета им. Г. И. Носова. — 2019. — № 4. — С. 106–112.</w:t>
       </w:r>
     </w:p>
     <w:p>
@@ -39668,7 +39668,7 @@
           <w:b w:val="0"/>
           <w:sz w:val="28"/>
         </w:rPr>
-        <w:t>36. Лисина, Е. С. Разработка тренинга развития профессиональных компетенций специалистов в сфере закупок : выпускная квалификационная работа [Электронный ресурс] / Е. С. Лисина. — URL: https://www.hse.ru/edu/vkr/1048201963 (дата обращения: 07.03.2026).</w:t>
+        <w:t>41. Измерение отдачи инвестиций в программе развития персонала [Электронный ресурс]. — URL: https://studfile.net/preview/10744172/page:9/ (дата обращения: 11.03.2026).</w:t>
       </w:r>
     </w:p>
     <w:p>
@@ -39681,7 +39681,7 @@
           <w:b w:val="0"/>
           <w:sz w:val="28"/>
         </w:rPr>
-        <w:t>37. Национальный исследовательский университет «Высшая школа экономики» (Пермь). Программа повышения квалификации «Управление закупками: эффективные стратегии и практики» [Электронный ресурс]. — URL: https://perm.hse.ru (дата обращения: 10.03.2026).</w:t>
+        <w:t>42. Мочкин, В. Оценка эффективности обучения: как понять, что тренинг прошел успешно [Электронный ресурс] / В. Мочкин // BTGconsult. — URL: https://btgconsult.ru/blog/learning-efficiency/ (дата обращения: 12.03.2026).</w:t>
       </w:r>
     </w:p>
     <w:p>
@@ -39694,7 +39694,7 @@
           <w:b w:val="0"/>
           <w:sz w:val="28"/>
         </w:rPr>
-        <w:t>38. Сибирский федеральный университет. Программа профессиональной переподготовки «Управление государственными, муниципальными и корпоративными закупками» [Электронный ресурс]. — URL: https://www.sfu-kras.ru (дата обращения: 10.03.2026).</w:t>
+        <w:t>43. Келман, С. Государственные закупки и управление: страх перед дискреционными полномочиями и качество государственного управления / С. Келман. — 2-е изд. — Вашингтон : AEI Press, 2022. — 240 с.</w:t>
       </w:r>
     </w:p>
     <w:p>
@@ -39707,7 +39707,7 @@
           <w:b w:val="0"/>
           <w:sz w:val="28"/>
         </w:rPr>
-        <w:t>39. Стоимость настройки и внедрения Битрикс24 для малого бизнеса [Электронный ресурс]. — URL: https://b24.org.ru/ (дата обращения: 28.04.2026).</w:t>
+        <w:t>44. Гертлер, П. Дж. Оценка воздействия на практике / П. Дж. Гертлер, С. Мартинес, П. Преманд, Л. Б. Роулингс, К. М. Дж. Вермерш. — 3-е изд. — Вашингтон : Всемирный банк ; Межамериканский банк развития, 2024. — 398 с.</w:t>
       </w:r>
     </w:p>
     <w:p>
@@ -39720,7 +39720,7 @@
           <w:b w:val="0"/>
           <w:sz w:val="28"/>
         </w:rPr>
-        <w:t>40. ЭТП РЕГИОН. Проект «Школа профессионалов» [Электронный ресурс]. — URL: https://www.region-ast.ru (дата обращения: 12.03.2026).</w:t>
+        <w:t>45. Контур.Школа. Курсы повышения квалификации по 44-ФЗ и 223-ФЗ [Электронный ресурс]. — URL: https://school.kontur-f.ru/ (дата обращения: 28.04.2026).</w:t>
       </w:r>
     </w:p>
     <w:p>
@@ -39733,7 +39733,72 @@
           <w:b w:val="0"/>
           <w:sz w:val="28"/>
         </w:rPr>
-        <w:t>41. ЭТП Аудиториум. Проект «Закупочные решения: игровые методы обучения» [Электронный ресурс]. — URL: https://etpgpb.ru (дата обращения: 11.03.2026).</w:t>
+        <w:t>46. iSpring Learn. LMS Pricing [Электронный ресурс]. — URL: https://ispringsolutions.com/ispring-learn/pricing (дата обращения: 28.04.2026).</w:t>
+      </w:r>
+    </w:p>
+    <w:p>
+      <w:pPr>
+        <w:spacing w:line="360" w:lineRule="auto" w:after="120"/>
+      </w:pPr>
+      <w:r>
+        <w:rPr>
+          <w:rFonts w:ascii="Times New Roman" w:hAnsi="Times New Roman"/>
+          <w:b w:val="0"/>
+          <w:sz w:val="28"/>
+        </w:rPr>
+        <w:t>47. Битрикс24. Тарифы и цены [Электронный ресурс]. — URL: https://www.bitrix24.ru/prices/ (дата обращения: 28.04.2026).</w:t>
+      </w:r>
+    </w:p>
+    <w:p>
+      <w:pPr>
+        <w:spacing w:line="360" w:lineRule="auto" w:after="120"/>
+      </w:pPr>
+      <w:r>
+        <w:rPr>
+          <w:rFonts w:ascii="Times New Roman" w:hAnsi="Times New Roman"/>
+          <w:b w:val="0"/>
+          <w:sz w:val="28"/>
+        </w:rPr>
+        <w:t>48. Стоимость настройки и внедрения Битрикс24 для малого бизнеса [Электронный ресурс]. — URL: https://b24.org.ru/ (дата обращения: 28.04.2026).</w:t>
+      </w:r>
+    </w:p>
+    <w:p>
+      <w:pPr>
+        <w:spacing w:line="360" w:lineRule="auto" w:after="120"/>
+      </w:pPr>
+      <w:r>
+        <w:rPr>
+          <w:rFonts w:ascii="Times New Roman" w:hAnsi="Times New Roman"/>
+          <w:b w:val="0"/>
+          <w:sz w:val="28"/>
+        </w:rPr>
+        <w:t>49. КриптоПро. Прайс-лист на лицензии КриптоПро CSP [Электронный ресурс]. — URL: https://cryptopro.ru/buy/price (дата обращения: 28.04.2026).</w:t>
+      </w:r>
+    </w:p>
+    <w:p>
+      <w:pPr>
+        <w:spacing w:line="360" w:lineRule="auto" w:after="120"/>
+      </w:pPr>
+      <w:r>
+        <w:rPr>
+          <w:rFonts w:ascii="Times New Roman" w:hAnsi="Times New Roman"/>
+          <w:b w:val="0"/>
+          <w:sz w:val="28"/>
+        </w:rPr>
+        <w:t>50. Банк России. Ключевая ставка Банка России [Электронный ресурс]. — URL: https://cbr.ru/hd_base/keyrate/ (дата обращения: 28.04.2026).</w:t>
+      </w:r>
+    </w:p>
+    <w:p>
+      <w:pPr>
+        <w:spacing w:line="360" w:lineRule="auto" w:after="120"/>
+      </w:pPr>
+      <w:r>
+        <w:rPr>
+          <w:rFonts w:ascii="Times New Roman" w:hAnsi="Times New Roman"/>
+          <w:b w:val="0"/>
+          <w:sz w:val="28"/>
+        </w:rPr>
+        <w:t>51. Разработка электронных курсов: ориентиры стоимости корпоративного e-learning [Электронный ресурс]. — URL: https://crmm.ru/ceny/ (дата обращения: 28.04.2026).</w:t>
       </w:r>
     </w:p>
     <w:sectPr>

</xml_diff>